<commit_message>
Update submission report cover page and AI plagiarism reports per LMS notice
</commit_message>
<xml_diff>
--- a/24070521505_AI_Plag_Dev_Dilip_Dhapodkar.docx
+++ b/24070521505_AI_Plag_Dev_Dilip_Dhapodkar.docx
@@ -7659,7 +7659,7 @@
                               <w:color w:val="171717"/>
                               <w:sz w:val="12"/>
                             </w:rPr>
-                            <w:t>1 of 39 - Cover</w:t>
+                            <w:t>1 of 12 - Cover</w:t>
                           </w:r>
                           <w:r>
                             <w:rPr>
@@ -7726,7 +7726,7 @@
                         <w:color w:val="171717"/>
                         <w:sz w:val="12"/>
                       </w:rPr>
-                      <w:t>1 of 39 - Cover</w:t>
+                      <w:t>1 of 12 - Cover</w:t>
                     </w:r>
                     <w:r>
                       <w:rPr>
@@ -7857,7 +7857,7 @@
                               <w:spacing w:val="-2"/>
                               <w:sz w:val="12"/>
                             </w:rPr>
-                            <w:t>1:3074638940</w:t>
+                            <w:t>1:3074812954</w:t>
                           </w:r>
                         </w:p>
                       </w:txbxContent>
@@ -7940,7 +7940,7 @@
                         <w:spacing w:val="-2"/>
                         <w:sz w:val="12"/>
                       </w:rPr>
-                      <w:t>1:3074638940</w:t>
+                      <w:t>1:3074812954</w:t>
                     </w:r>
                   </w:p>
                 </w:txbxContent>
@@ -8119,7 +8119,7 @@
                               <w:w w:val="105"/>
                               <w:sz w:val="12"/>
                             </w:rPr>
-                            <w:t>39</w:t>
+                            <w:t>12</w:t>
                           </w:r>
                           <w:r>
                             <w:rPr>
@@ -8259,7 +8259,7 @@
                         <w:w w:val="105"/>
                         <w:sz w:val="12"/>
                       </w:rPr>
-                      <w:t>39</w:t>
+                      <w:t>12</w:t>
                     </w:r>
                     <w:r>
                       <w:rPr>
@@ -8426,7 +8426,7 @@
                               <w:spacing w:val="-2"/>
                               <w:sz w:val="12"/>
                             </w:rPr>
-                            <w:t>1:3074638940</w:t>
+                            <w:t>1:3074812954</w:t>
                           </w:r>
                         </w:p>
                       </w:txbxContent>
@@ -8509,7 +8509,7 @@
                         <w:spacing w:val="-2"/>
                         <w:sz w:val="12"/>
                       </w:rPr>
-                      <w:t>1:3074638940</w:t>
+                      <w:t>1:3074812954</w:t>
                     </w:r>
                   </w:p>
                 </w:txbxContent>
@@ -8980,7 +8980,7 @@
                               <w:spacing w:val="-2"/>
                               <w:sz w:val="12"/>
                             </w:rPr>
-                            <w:t>1:3074638940</w:t>
+                            <w:t>1:3074812954</w:t>
                           </w:r>
                         </w:p>
                       </w:txbxContent>
@@ -9063,7 +9063,7 @@
                         <w:spacing w:val="-2"/>
                         <w:sz w:val="12"/>
                       </w:rPr>
-                      <w:t>1:3074638940</w:t>
+                      <w:t>1:3074812954</w:t>
                     </w:r>
                   </w:p>
                 </w:txbxContent>
@@ -9224,7 +9224,7 @@
                               <w:color w:val="171717"/>
                               <w:sz w:val="12"/>
                             </w:rPr>
-                            <w:t>1 of 39 - Cover</w:t>
+                            <w:t>1 of 12 - Cover</w:t>
                           </w:r>
                           <w:r>
                             <w:rPr>
@@ -9291,7 +9291,7 @@
                         <w:color w:val="171717"/>
                         <w:sz w:val="12"/>
                       </w:rPr>
-                      <w:t>1 of 39 - Cover</w:t>
+                      <w:t>1 of 12 - Cover</w:t>
                     </w:r>
                     <w:r>
                       <w:rPr>
@@ -9422,7 +9422,7 @@
                               <w:spacing w:val="-2"/>
                               <w:sz w:val="12"/>
                             </w:rPr>
-                            <w:t>1:3074638940</w:t>
+                            <w:t>1:3074812954</w:t>
                           </w:r>
                         </w:p>
                       </w:txbxContent>
@@ -9505,7 +9505,7 @@
                         <w:spacing w:val="-2"/>
                         <w:sz w:val="12"/>
                       </w:rPr>
-                      <w:t>1:3074638940</w:t>
+                      <w:t>1:3074812954</w:t>
                     </w:r>
                   </w:p>
                 </w:txbxContent>
@@ -9684,7 +9684,7 @@
                               <w:w w:val="105"/>
                               <w:sz w:val="12"/>
                             </w:rPr>
-                            <w:t>39</w:t>
+                            <w:t>12</w:t>
                           </w:r>
                           <w:r>
                             <w:rPr>
@@ -9824,7 +9824,7 @@
                         <w:w w:val="105"/>
                         <w:sz w:val="12"/>
                       </w:rPr>
-                      <w:t>39</w:t>
+                      <w:t>12</w:t>
                     </w:r>
                     <w:r>
                       <w:rPr>
@@ -9991,7 +9991,7 @@
                               <w:spacing w:val="-2"/>
                               <w:sz w:val="12"/>
                             </w:rPr>
-                            <w:t>1:3074638940</w:t>
+                            <w:t>1:3074812954</w:t>
                           </w:r>
                         </w:p>
                       </w:txbxContent>
@@ -10074,7 +10074,7 @@
                         <w:spacing w:val="-2"/>
                         <w:sz w:val="12"/>
                       </w:rPr>
-                      <w:t>1:3074638940</w:t>
+                      <w:t>1:3074812954</w:t>
                     </w:r>
                   </w:p>
                 </w:txbxContent>
@@ -10545,7 +10545,7 @@
                               <w:spacing w:val="-2"/>
                               <w:sz w:val="12"/>
                             </w:rPr>
-                            <w:t>1:3074638940</w:t>
+                            <w:t>1:3074812954</w:t>
                           </w:r>
                         </w:p>
                       </w:txbxContent>
@@ -10628,7 +10628,7 @@
                         <w:spacing w:val="-2"/>
                         <w:sz w:val="12"/>
                       </w:rPr>
-                      <w:t>1:3074638940</w:t>
+                      <w:t>1:3074812954</w:t>
                     </w:r>
                   </w:p>
                 </w:txbxContent>

</xml_diff>